<commit_message>
Fold references.md into report and remove standalone file
Append section-grouped link list as "Further Reading" appendix in
the report markdown and DOCX, then delete resources/references.md.
</commit_message>
<xml_diff>
--- a/resources/assignment-report.docx
+++ b/resources/assignment-report.docx
@@ -6897,6 +6897,426 @@
       <w:r>
         <w:t xml:space="preserve">, 137–142.</w:t>
       </w:r>
+    </w:p>
+    <w:p>
+      <w:r>
+        <w:pict>
+          <v:rect style="width:0;height:1.5pt" o:hralign="center" o:hrstd="t" o:hr="t"/>
+        </w:pict>
+      </w:r>
+    </w:p>
+    <w:p>
+      <w:pPr>
+        <w:pStyle w:val="Heading2"/>
+      </w:pPr>
+      <w:bookmarkStart w:id="47" w:name="further-reading-links-by-report-section"/>
+      <w:r>
+        <w:t xml:space="preserve">Further Reading — Links by Report Section</w:t>
+      </w:r>
+      <w:bookmarkEnd w:id="47"/>
+    </w:p>
+    <w:p>
+      <w:pPr>
+        <w:pStyle w:val="Heading3"/>
+      </w:pPr>
+      <w:bookmarkStart w:id="48" w:name="task-1-description-of-program"/>
+      <w:r>
+        <w:t xml:space="preserve">Task 1: Description of Program</w:t>
+      </w:r>
+      <w:bookmarkEnd w:id="48"/>
+    </w:p>
+    <w:p>
+      <w:pPr>
+        <w:numPr>
+          <w:ilvl w:val="0"/>
+          <w:numId w:val="1014"/>
+        </w:numPr>
+        <w:pStyle w:val="Compact"/>
+      </w:pPr>
+      <w:hyperlink r:id="rId49">
+        <w:r>
+          <w:rPr>
+            <w:rStyle w:val="Hyperlink"/>
+          </w:rPr>
+          <w:t xml:space="preserve">Support Vector Machine — Wikipedia</w:t>
+        </w:r>
+      </w:hyperlink>
+    </w:p>
+    <w:p>
+      <w:pPr>
+        <w:numPr>
+          <w:ilvl w:val="0"/>
+          <w:numId w:val="1014"/>
+        </w:numPr>
+        <w:pStyle w:val="Compact"/>
+      </w:pPr>
+      <w:hyperlink r:id="rId50">
+        <w:r>
+          <w:rPr>
+            <w:rStyle w:val="Hyperlink"/>
+          </w:rPr>
+          <w:t xml:space="preserve">Sequential Minimal Optimization — Wikipedia</w:t>
+        </w:r>
+      </w:hyperlink>
+    </w:p>
+    <w:p>
+      <w:pPr>
+        <w:numPr>
+          <w:ilvl w:val="0"/>
+          <w:numId w:val="1014"/>
+        </w:numPr>
+        <w:pStyle w:val="Compact"/>
+      </w:pPr>
+      <w:hyperlink r:id="rId51">
+        <w:r>
+          <w:rPr>
+            <w:rStyle w:val="Hyperlink"/>
+          </w:rPr>
+          <w:t xml:space="preserve">Support Vector Machines — scikit-learn</w:t>
+        </w:r>
+      </w:hyperlink>
+    </w:p>
+    <w:p>
+      <w:pPr>
+        <w:pStyle w:val="Heading3"/>
+      </w:pPr>
+      <w:bookmarkStart w:id="52" w:name="task-1-dataset"/>
+      <w:r>
+        <w:t xml:space="preserve">Task 1: Dataset</w:t>
+      </w:r>
+      <w:bookmarkEnd w:id="52"/>
+    </w:p>
+    <w:p>
+      <w:pPr>
+        <w:numPr>
+          <w:ilvl w:val="0"/>
+          <w:numId w:val="1015"/>
+        </w:numPr>
+        <w:pStyle w:val="Compact"/>
+      </w:pPr>
+      <w:hyperlink r:id="rId53">
+        <w:r>
+          <w:rPr>
+            <w:rStyle w:val="Hyperlink"/>
+          </w:rPr>
+          <w:t xml:space="preserve">Breast Cancer Wisconsin (Diagnostic) — UCI ML Repository</w:t>
+        </w:r>
+      </w:hyperlink>
+    </w:p>
+    <w:p>
+      <w:pPr>
+        <w:numPr>
+          <w:ilvl w:val="0"/>
+          <w:numId w:val="1015"/>
+        </w:numPr>
+        <w:pStyle w:val="Compact"/>
+      </w:pPr>
+      <w:hyperlink r:id="rId54">
+        <w:r>
+          <w:rPr>
+            <w:rStyle w:val="Hyperlink"/>
+          </w:rPr>
+          <w:t xml:space="preserve">How Common Is Breast Cancer? — American Cancer Society</w:t>
+        </w:r>
+      </w:hyperlink>
+    </w:p>
+    <w:p>
+      <w:pPr>
+        <w:pStyle w:val="Heading3"/>
+      </w:pPr>
+      <w:bookmarkStart w:id="55" w:name="X94de4d63cc7d7277fe3627c496af4df652f8255"/>
+      <w:r>
+        <w:t xml:space="preserve">Task 1: Algorithm Implementation and Parameters</w:t>
+      </w:r>
+      <w:bookmarkEnd w:id="55"/>
+    </w:p>
+    <w:p>
+      <w:pPr>
+        <w:numPr>
+          <w:ilvl w:val="0"/>
+          <w:numId w:val="1016"/>
+        </w:numPr>
+        <w:pStyle w:val="Compact"/>
+      </w:pPr>
+      <w:hyperlink r:id="rId56">
+        <w:r>
+          <w:rPr>
+            <w:rStyle w:val="Hyperlink"/>
+          </w:rPr>
+          <w:t xml:space="preserve">Radial Basis Function Kernel — Wikipedia</w:t>
+        </w:r>
+      </w:hyperlink>
+    </w:p>
+    <w:p>
+      <w:pPr>
+        <w:numPr>
+          <w:ilvl w:val="0"/>
+          <w:numId w:val="1016"/>
+        </w:numPr>
+        <w:pStyle w:val="Compact"/>
+      </w:pPr>
+      <w:hyperlink r:id="rId57">
+        <w:r>
+          <w:rPr>
+            <w:rStyle w:val="Hyperlink"/>
+          </w:rPr>
+          <w:t xml:space="preserve">Polynomial Kernel — Wikipedia</w:t>
+        </w:r>
+      </w:hyperlink>
+    </w:p>
+    <w:p>
+      <w:pPr>
+        <w:numPr>
+          <w:ilvl w:val="0"/>
+          <w:numId w:val="1016"/>
+        </w:numPr>
+        <w:pStyle w:val="Compact"/>
+      </w:pPr>
+      <w:hyperlink r:id="rId50">
+        <w:r>
+          <w:rPr>
+            <w:rStyle w:val="Hyperlink"/>
+          </w:rPr>
+          <w:t xml:space="preserve">Sequential Minimal Optimization — Wikipedia</w:t>
+        </w:r>
+      </w:hyperlink>
+    </w:p>
+    <w:p>
+      <w:pPr>
+        <w:pStyle w:val="Heading3"/>
+      </w:pPr>
+      <w:bookmarkStart w:id="58" w:name="task-1-training-of-algorithm"/>
+      <w:r>
+        <w:t xml:space="preserve">Task 1: Training of Algorithm</w:t>
+      </w:r>
+      <w:bookmarkEnd w:id="58"/>
+    </w:p>
+    <w:p>
+      <w:pPr>
+        <w:numPr>
+          <w:ilvl w:val="0"/>
+          <w:numId w:val="1017"/>
+        </w:numPr>
+        <w:pStyle w:val="Compact"/>
+      </w:pPr>
+      <w:hyperlink r:id="rId59">
+        <w:r>
+          <w:rPr>
+            <w:rStyle w:val="Hyperlink"/>
+          </w:rPr>
+          <w:t xml:space="preserve">Cross-validation (Statistics) — Wikipedia</w:t>
+        </w:r>
+      </w:hyperlink>
+    </w:p>
+    <w:p>
+      <w:pPr>
+        <w:numPr>
+          <w:ilvl w:val="0"/>
+          <w:numId w:val="1017"/>
+        </w:numPr>
+        <w:pStyle w:val="Compact"/>
+      </w:pPr>
+      <w:hyperlink r:id="rId51">
+        <w:r>
+          <w:rPr>
+            <w:rStyle w:val="Hyperlink"/>
+          </w:rPr>
+          <w:t xml:space="preserve">Support Vector Machines — scikit-learn</w:t>
+        </w:r>
+      </w:hyperlink>
+    </w:p>
+    <w:p>
+      <w:pPr>
+        <w:pStyle w:val="Heading3"/>
+      </w:pPr>
+      <w:bookmarkStart w:id="60" w:name="task-1-results"/>
+      <w:r>
+        <w:t xml:space="preserve">Task 1: Results</w:t>
+      </w:r>
+      <w:bookmarkEnd w:id="60"/>
+    </w:p>
+    <w:p>
+      <w:pPr>
+        <w:numPr>
+          <w:ilvl w:val="0"/>
+          <w:numId w:val="1018"/>
+        </w:numPr>
+        <w:pStyle w:val="Compact"/>
+      </w:pPr>
+      <w:hyperlink r:id="rId61">
+        <w:r>
+          <w:rPr>
+            <w:rStyle w:val="Hyperlink"/>
+          </w:rPr>
+          <w:t xml:space="preserve">Confusion Matrix — Wikipedia</w:t>
+        </w:r>
+      </w:hyperlink>
+    </w:p>
+    <w:p>
+      <w:pPr>
+        <w:numPr>
+          <w:ilvl w:val="0"/>
+          <w:numId w:val="1018"/>
+        </w:numPr>
+        <w:pStyle w:val="Compact"/>
+      </w:pPr>
+      <w:hyperlink r:id="rId62">
+        <w:r>
+          <w:rPr>
+            <w:rStyle w:val="Hyperlink"/>
+          </w:rPr>
+          <w:t xml:space="preserve">Precision and Recall — Wikipedia</w:t>
+        </w:r>
+      </w:hyperlink>
+    </w:p>
+    <w:p>
+      <w:pPr>
+        <w:numPr>
+          <w:ilvl w:val="0"/>
+          <w:numId w:val="1018"/>
+        </w:numPr>
+        <w:pStyle w:val="Compact"/>
+      </w:pPr>
+      <w:hyperlink r:id="rId63">
+        <w:r>
+          <w:rPr>
+            <w:rStyle w:val="Hyperlink"/>
+          </w:rPr>
+          <w:t xml:space="preserve">F-score — Wikipedia</w:t>
+        </w:r>
+      </w:hyperlink>
+    </w:p>
+    <w:p>
+      <w:pPr>
+        <w:pStyle w:val="Heading3"/>
+      </w:pPr>
+      <w:bookmarkStart w:id="64" w:name="task-2-ability-of-chosen-algorithm"/>
+      <w:r>
+        <w:t xml:space="preserve">Task 2: Ability of Chosen Algorithm</w:t>
+      </w:r>
+      <w:bookmarkEnd w:id="64"/>
+    </w:p>
+    <w:p>
+      <w:pPr>
+        <w:numPr>
+          <w:ilvl w:val="0"/>
+          <w:numId w:val="1019"/>
+        </w:numPr>
+        <w:pStyle w:val="Compact"/>
+      </w:pPr>
+      <w:hyperlink r:id="rId49">
+        <w:r>
+          <w:rPr>
+            <w:rStyle w:val="Hyperlink"/>
+          </w:rPr>
+          <w:t xml:space="preserve">Support Vector Machine — Wikipedia</w:t>
+        </w:r>
+      </w:hyperlink>
+    </w:p>
+    <w:p>
+      <w:pPr>
+        <w:numPr>
+          <w:ilvl w:val="0"/>
+          <w:numId w:val="1019"/>
+        </w:numPr>
+        <w:pStyle w:val="Compact"/>
+      </w:pPr>
+      <w:hyperlink r:id="rId51">
+        <w:r>
+          <w:rPr>
+            <w:rStyle w:val="Hyperlink"/>
+          </w:rPr>
+          <w:t xml:space="preserve">Support Vector Machines — scikit-learn</w:t>
+        </w:r>
+      </w:hyperlink>
+    </w:p>
+    <w:p>
+      <w:pPr>
+        <w:pStyle w:val="Heading3"/>
+      </w:pPr>
+      <w:bookmarkStart w:id="65" w:name="task-2-limitations-of-chosen-algorithm"/>
+      <w:r>
+        <w:t xml:space="preserve">Task 2: Limitations of Chosen Algorithm</w:t>
+      </w:r>
+      <w:bookmarkEnd w:id="65"/>
+    </w:p>
+    <w:p>
+      <w:pPr>
+        <w:numPr>
+          <w:ilvl w:val="0"/>
+          <w:numId w:val="1020"/>
+        </w:numPr>
+        <w:pStyle w:val="Compact"/>
+      </w:pPr>
+      <w:hyperlink r:id="rId49">
+        <w:r>
+          <w:rPr>
+            <w:rStyle w:val="Hyperlink"/>
+          </w:rPr>
+          <w:t xml:space="preserve">Support Vector Machine — Wikipedia</w:t>
+        </w:r>
+      </w:hyperlink>
+    </w:p>
+    <w:p>
+      <w:pPr>
+        <w:numPr>
+          <w:ilvl w:val="0"/>
+          <w:numId w:val="1020"/>
+        </w:numPr>
+        <w:pStyle w:val="Compact"/>
+      </w:pPr>
+      <w:hyperlink r:id="rId51">
+        <w:r>
+          <w:rPr>
+            <w:rStyle w:val="Hyperlink"/>
+          </w:rPr>
+          <w:t xml:space="preserve">Support Vector Machines — scikit-learn</w:t>
+        </w:r>
+      </w:hyperlink>
+    </w:p>
+    <w:p>
+      <w:pPr>
+        <w:pStyle w:val="Heading3"/>
+      </w:pPr>
+      <w:bookmarkStart w:id="66" w:name="task-2-uses-of-chosen-algorithm"/>
+      <w:r>
+        <w:t xml:space="preserve">Task 2: Uses of Chosen Algorithm</w:t>
+      </w:r>
+      <w:bookmarkEnd w:id="66"/>
+    </w:p>
+    <w:p>
+      <w:pPr>
+        <w:numPr>
+          <w:ilvl w:val="0"/>
+          <w:numId w:val="1021"/>
+        </w:numPr>
+        <w:pStyle w:val="Compact"/>
+      </w:pPr>
+      <w:hyperlink r:id="rId49">
+        <w:r>
+          <w:rPr>
+            <w:rStyle w:val="Hyperlink"/>
+          </w:rPr>
+          <w:t xml:space="preserve">Support Vector Machine — Wikipedia</w:t>
+        </w:r>
+      </w:hyperlink>
+    </w:p>
+    <w:p>
+      <w:pPr>
+        <w:numPr>
+          <w:ilvl w:val="0"/>
+          <w:numId w:val="1021"/>
+        </w:numPr>
+        <w:pStyle w:val="Compact"/>
+      </w:pPr>
+      <w:hyperlink r:id="rId54">
+        <w:r>
+          <w:rPr>
+            <w:rStyle w:val="Hyperlink"/>
+          </w:rPr>
+          <w:t xml:space="preserve">How Common Is Breast Cancer? — American Cancer Society</w:t>
+        </w:r>
+      </w:hyperlink>
     </w:p>
     <w:sectPr/>
   </w:body>
@@ -7422,6 +7842,30 @@
     <w:lvlOverride w:ilvl="8">
       <w:startOverride w:val="1"/>
     </w:lvlOverride>
+  </w:num>
+  <w:num w:numId="1014">
+    <w:abstractNumId w:val="991"/>
+  </w:num>
+  <w:num w:numId="1015">
+    <w:abstractNumId w:val="991"/>
+  </w:num>
+  <w:num w:numId="1016">
+    <w:abstractNumId w:val="991"/>
+  </w:num>
+  <w:num w:numId="1017">
+    <w:abstractNumId w:val="991"/>
+  </w:num>
+  <w:num w:numId="1018">
+    <w:abstractNumId w:val="991"/>
+  </w:num>
+  <w:num w:numId="1019">
+    <w:abstractNumId w:val="991"/>
+  </w:num>
+  <w:num w:numId="1020">
+    <w:abstractNumId w:val="991"/>
+  </w:num>
+  <w:num w:numId="1021">
+    <w:abstractNumId w:val="991"/>
   </w:num>
 </w:numbering>
 </file>

</xml_diff>

<commit_message>
Update docs and report to reference plotting script and figures
Add figure generation instructions to README, usage guide, and
architecture doc. Add figure references throughout the report
for CV folds, kernel comparisons, grid search heatmaps, and
confusion matrices. Re-export DOCX.
</commit_message>
<xml_diff>
--- a/resources/assignment-report.docx
+++ b/resources/assignment-report.docx
@@ -466,7 +466,31 @@
         <w:pStyle w:val="FirstParagraph"/>
       </w:pPr>
       <w:r>
-        <w:t xml:space="preserve">A complete run takes a few seconds on a typical desktop CPU and prints the baseline results, the cross-validation accuracy, the per-kernel comparison, the full grid-search trace, and the final results table for the optimised models.</w:t>
+        <w:t xml:space="preserve">A complete run takes a few seconds on a typical desktop CPU and prints the baseline results, the cross-validation accuracy, the per-kernel comparison, the full grid-search trace, and the final results table for the optimised models. A companion Python script (</w:t>
+      </w:r>
+      <w:r>
+        <w:rPr>
+          <w:rStyle w:val="VerbatimChar"/>
+        </w:rPr>
+        <w:t xml:space="preserve">plot_results.py</w:t>
+      </w:r>
+      <w:r>
+        <w:t xml:space="preserve">) parses the program’s stdout and generates publication-quality figures — confusion matrix heatmaps, kernel comparison bar charts, grid search heatmaps, and a cross-validation fold chart — into a</w:t>
+      </w:r>
+      <w:r>
+        <w:t xml:space="preserve"> </w:t>
+      </w:r>
+      <w:r>
+        <w:rPr>
+          <w:rStyle w:val="VerbatimChar"/>
+        </w:rPr>
+        <w:t xml:space="preserve">figures/</w:t>
+      </w:r>
+      <w:r>
+        <w:t xml:space="preserve"> </w:t>
+      </w:r>
+      <w:r>
+        <w:t xml:space="preserve">directory.</w:t>
       </w:r>
     </w:p>
     <w:p>
@@ -3863,7 +3887,19 @@
         <w:t xml:space="preserve"> </w:t>
       </w:r>
       <w:r>
-        <w:t xml:space="preserve">runs. Five folds was chosen as a standard compromise: it gives reasonably stable estimates without making the grid search unaffordably slow.</w:t>
+        <w:t xml:space="preserve">runs. Five folds was chosen as a standard compromise: it gives reasonably stable estimates without making the grid search unaffordably slow. The per-fold accuracy spread is visualised in</w:t>
+      </w:r>
+      <w:r>
+        <w:t xml:space="preserve"> </w:t>
+      </w:r>
+      <w:r>
+        <w:rPr>
+          <w:rStyle w:val="VerbatimChar"/>
+        </w:rPr>
+        <w:t xml:space="preserve">figures/cv_folds.png</w:t>
+      </w:r>
+      <w:r>
+        <w:t xml:space="preserve">.</w:t>
       </w:r>
     </w:p>
     <w:p>
@@ -4337,7 +4373,19 @@
         <w:pStyle w:val="BodyText"/>
       </w:pPr>
       <w:r>
-        <w:t xml:space="preserve">A practical observation from the grid search trace is that the best combinations all involve</w:t>
+        <w:t xml:space="preserve">The grid search landscape is visualised as C-vs-gamma heatmaps in</w:t>
+      </w:r>
+      <w:r>
+        <w:t xml:space="preserve"> </w:t>
+      </w:r>
+      <w:r>
+        <w:rPr>
+          <w:rStyle w:val="VerbatimChar"/>
+        </w:rPr>
+        <w:t xml:space="preserve">figures/grid_search_heatmaps.png</w:t>
+      </w:r>
+      <w:r>
+        <w:t xml:space="preserve">, with the best cell highlighted for each kernel. A practical observation from the grid search trace is that the best combinations all involve</w:t>
       </w:r>
       <w:r>
         <w:t xml:space="preserve"> </w:t>
@@ -4739,7 +4787,22 @@
         <w:pStyle w:val="BodyText"/>
       </w:pPr>
       <w:r>
-        <w:t xml:space="preserve">These baselines are revealing rather than competitive. With</w:t>
+        <w:t xml:space="preserve">These baselines are revealing rather than competitive (see</w:t>
+      </w:r>
+      <w:r>
+        <w:t xml:space="preserve"> </w:t>
+      </w:r>
+      <w:r>
+        <w:rPr>
+          <w:rStyle w:val="VerbatimChar"/>
+        </w:rPr>
+        <w:t xml:space="preserve">figures/kernel_comparison_default.png</w:t>
+      </w:r>
+      <w:r>
+        <w:t xml:space="preserve"> </w:t>
+      </w:r>
+      <w:r>
+        <w:t xml:space="preserve">for the visual comparison). With</w:t>
       </w:r>
       <w:r>
         <w:t xml:space="preserve"> </w:t>
@@ -4915,7 +4978,37 @@
         <w:pStyle w:val="FirstParagraph"/>
       </w:pPr>
       <w:r>
-        <w:t xml:space="preserve">After the grid search and retraining on the 80/20 split with the best per-kernel configuration:</w:t>
+        <w:t xml:space="preserve">After the grid search and retraining on the 80/20 split with the best per-kernel configuration (see</w:t>
+      </w:r>
+      <w:r>
+        <w:t xml:space="preserve"> </w:t>
+      </w:r>
+      <w:r>
+        <w:rPr>
+          <w:rStyle w:val="VerbatimChar"/>
+        </w:rPr>
+        <w:t xml:space="preserve">figures/kernel_comparison_optimised.png</w:t>
+      </w:r>
+      <w:r>
+        <w:t xml:space="preserve"> </w:t>
+      </w:r>
+      <w:r>
+        <w:t xml:space="preserve">and</w:t>
+      </w:r>
+      <w:r>
+        <w:t xml:space="preserve"> </w:t>
+      </w:r>
+      <w:r>
+        <w:rPr>
+          <w:rStyle w:val="VerbatimChar"/>
+        </w:rPr>
+        <w:t xml:space="preserve">figures/default_vs_optimised.png</w:t>
+      </w:r>
+      <w:r>
+        <w:t xml:space="preserve"> </w:t>
+      </w:r>
+      <w:r>
+        <w:t xml:space="preserve">for visual comparisons):</w:t>
       </w:r>
     </w:p>
     <w:tbl>
@@ -5606,6 +5699,26 @@
       </w:r>
       <w:r>
         <w:t xml:space="preserve">The gap between Linear baseline (41.6%) and Linear optimised (97.4%) is much larger than the gap between any two optimised kernels (97.4% vs 90.3% vs 95.6%). For a practitioner, time spent on grid search yields larger returns than time spent on architectural choices.</w:t>
+      </w:r>
+    </w:p>
+    <w:p>
+      <w:pPr>
+        <w:pStyle w:val="FirstParagraph"/>
+      </w:pPr>
+      <w:r>
+        <w:t xml:space="preserve">Confusion matrices for all four models (initial RBF baseline plus the three optimised kernels) are visualised in</w:t>
+      </w:r>
+      <w:r>
+        <w:t xml:space="preserve"> </w:t>
+      </w:r>
+      <w:r>
+        <w:rPr>
+          <w:rStyle w:val="VerbatimChar"/>
+        </w:rPr>
+        <w:t xml:space="preserve">figures/confusion_matrices.png</w:t>
+      </w:r>
+      <w:r>
+        <w:t xml:space="preserve">.</w:t>
       </w:r>
     </w:p>
     <w:p>

</xml_diff>

<commit_message>
Embed all 14 figures inline in report; tighten citations and Python deps note
</commit_message>
<xml_diff>
--- a/resources/assignment-report.docx
+++ b/resources/assignment-report.docx
@@ -185,7 +185,37 @@
         <w:t xml:space="preserve"> </w:t>
       </w:r>
       <w:r>
-        <w:t xml:space="preserve">algorithm for training, originally introduced by John Platt at Microsoft Research (Platt, 1998). SMO is the most widely used method for solving the SVM dual problem because it decomposes the global quadratic program into a sequence of analytically solvable two-variable sub-problems, which means no general-purpose QP solver is required. The implementation also applies an</w:t>
+        <w:t xml:space="preserve">algorithm for training, originally introduced by John Platt at Microsoft Research (Platt, 1998). SMO is the most widely used method for solving the SVM dual problem because it decomposes the global quadratic program into a sequence of analytically solvable two-variable sub-problems, which means no general-purpose QP solver is required. The same algorithm — with additional refinements — is the basis of widely deployed implementations such as</w:t>
+      </w:r>
+      <w:r>
+        <w:t xml:space="preserve"> </w:t>
+      </w:r>
+      <w:r>
+        <w:rPr>
+          <w:rStyle w:val="VerbatimChar"/>
+        </w:rPr>
+        <w:t xml:space="preserve">libsvm</w:t>
+      </w:r>
+      <w:r>
+        <w:t xml:space="preserve"> </w:t>
+      </w:r>
+      <w:r>
+        <w:t xml:space="preserve">and the</w:t>
+      </w:r>
+      <w:r>
+        <w:t xml:space="preserve"> </w:t>
+      </w:r>
+      <w:r>
+        <w:rPr>
+          <w:rStyle w:val="VerbatimChar"/>
+        </w:rPr>
+        <w:t xml:space="preserve">SVC</w:t>
+      </w:r>
+      <w:r>
+        <w:t xml:space="preserve"> </w:t>
+      </w:r>
+      <w:r>
+        <w:t xml:space="preserve">class in scikit-learn (Scikit-learn developers). The implementation also applies an</w:t>
       </w:r>
       <w:r>
         <w:t xml:space="preserve"> </w:t>
@@ -747,7 +777,34 @@
         <w:t xml:space="preserve">figures/ionosphere_grid_search_heatmaps.png</w:t>
       </w:r>
       <w:r>
-        <w:t xml:space="preserve">).</w:t>
+        <w:t xml:space="preserve">). The plotting script requires Python 3 with</w:t>
+      </w:r>
+      <w:r>
+        <w:t xml:space="preserve"> </w:t>
+      </w:r>
+      <w:r>
+        <w:rPr>
+          <w:rStyle w:val="VerbatimChar"/>
+        </w:rPr>
+        <w:t xml:space="preserve">matplotlib</w:t>
+      </w:r>
+      <w:r>
+        <w:t xml:space="preserve"> </w:t>
+      </w:r>
+      <w:r>
+        <w:t xml:space="preserve">and</w:t>
+      </w:r>
+      <w:r>
+        <w:t xml:space="preserve"> </w:t>
+      </w:r>
+      <w:r>
+        <w:rPr>
+          <w:rStyle w:val="VerbatimChar"/>
+        </w:rPr>
+        <w:t xml:space="preserve">numpy</w:t>
+      </w:r>
+      <w:r>
+        <w:t xml:space="preserve">; these are only needed to regenerate figures, not to build or run the C++ classifier itself.</w:t>
       </w:r>
     </w:p>
     <w:p>
@@ -1972,7 +2029,7 @@
         <w:pStyle w:val="FirstParagraph"/>
       </w:pPr>
       <w:r>
-        <w:t xml:space="preserve">A Support Vector Machine is a supervised learning algorithm that finds the optimal separating hyperplane between two classes (Cortes &amp; Vapnik, 1995). In the linearly separable case the</w:t>
+        <w:t xml:space="preserve">A Support Vector Machine is a supervised learning algorithm that finds the optimal separating hyperplane between two classes (Cortes &amp; Vapnik, 1995; Burges, 1998). In the linearly separable case the</w:t>
       </w:r>
       <w:r>
         <w:t xml:space="preserve"> </w:t>
@@ -4638,19 +4695,7 @@
         <w:t xml:space="preserve"> </w:t>
       </w:r>
       <w:r>
-        <w:t xml:space="preserve">runs. Five folds was chosen as a standard compromise: it gives reasonably stable estimates without making the grid search unaffordably slow. The per-fold accuracy spread for each dataset is visualised in</w:t>
-      </w:r>
-      <w:r>
-        <w:t xml:space="preserve"> </w:t>
-      </w:r>
-      <w:r>
-        <w:rPr>
-          <w:rStyle w:val="VerbatimChar"/>
-        </w:rPr>
-        <w:t xml:space="preserve">figures/&lt;slug&gt;_cv_folds.png</w:t>
-      </w:r>
-      <w:r>
-        <w:t xml:space="preserve">.</w:t>
+        <w:t xml:space="preserve">runs. Five folds was chosen as a standard compromise: it gives reasonably stable estimates without making the grid search unaffordably slow.</w:t>
       </w:r>
     </w:p>
     <w:p>
@@ -4675,13 +4720,186 @@
     </w:p>
     <w:p>
       <w:pPr>
+        <w:pStyle w:val="BodyText"/>
+      </w:pPr>
+      <w:r>
+        <w:t xml:space="preserve">The per-fold accuracy spread for each dataset is shown below.</w:t>
+      </w:r>
+    </w:p>
+    <w:p>
+      <w:pPr>
+        <w:pStyle w:val="CaptionedFigure"/>
+      </w:pPr>
+      <w:r>
+        <w:drawing>
+          <wp:inline>
+            <wp:extent cx="5334000" cy="3287708"/>
+            <wp:effectExtent b="0" l="0" r="0" t="0"/>
+            <wp:docPr descr="Ionosphere — 5-fold cross-validation per-fold accuracy with mean line" title="" id="1" name="Picture"/>
+            <a:graphic>
+              <a:graphicData uri="http://schemas.openxmlformats.org/drawingml/2006/picture">
+                <pic:pic>
+                  <pic:nvPicPr>
+                    <pic:cNvPr descr="../figures/ionosphere_cv_folds.png" id="0" name="Picture"/>
+                    <pic:cNvPicPr>
+                      <a:picLocks noChangeArrowheads="1" noChangeAspect="1"/>
+                    </pic:cNvPicPr>
+                  </pic:nvPicPr>
+                  <pic:blipFill>
+                    <a:blip r:embed="rId36"/>
+                    <a:stretch>
+                      <a:fillRect/>
+                    </a:stretch>
+                  </pic:blipFill>
+                  <pic:spPr bwMode="auto">
+                    <a:xfrm>
+                      <a:off x="0" y="0"/>
+                      <a:ext cx="5334000" cy="3287708"/>
+                    </a:xfrm>
+                    <a:prstGeom prst="rect">
+                      <a:avLst/>
+                    </a:prstGeom>
+                    <a:noFill/>
+                    <a:ln w="9525">
+                      <a:noFill/>
+                      <a:headEnd/>
+                      <a:tailEnd/>
+                    </a:ln>
+                  </pic:spPr>
+                </pic:pic>
+              </a:graphicData>
+            </a:graphic>
+          </wp:inline>
+        </w:drawing>
+      </w:r>
+    </w:p>
+    <w:p>
+      <w:pPr>
+        <w:pStyle w:val="ImageCaption"/>
+      </w:pPr>
+      <w:r>
+        <w:t xml:space="preserve">Ionosphere — 5-fold cross-validation per-fold accuracy with mean line</w:t>
+      </w:r>
+    </w:p>
+    <w:p>
+      <w:pPr>
+        <w:pStyle w:val="CaptionedFigure"/>
+      </w:pPr>
+      <w:r>
+        <w:drawing>
+          <wp:inline>
+            <wp:extent cx="5334000" cy="3276535"/>
+            <wp:effectExtent b="0" l="0" r="0" t="0"/>
+            <wp:docPr descr="Banknote — 5-fold cross-validation per-fold accuracy with mean line" title="" id="1" name="Picture"/>
+            <a:graphic>
+              <a:graphicData uri="http://schemas.openxmlformats.org/drawingml/2006/picture">
+                <pic:pic>
+                  <pic:nvPicPr>
+                    <pic:cNvPr descr="../figures/banknote_cv_folds.png" id="0" name="Picture"/>
+                    <pic:cNvPicPr>
+                      <a:picLocks noChangeArrowheads="1" noChangeAspect="1"/>
+                    </pic:cNvPicPr>
+                  </pic:nvPicPr>
+                  <pic:blipFill>
+                    <a:blip r:embed="rId37"/>
+                    <a:stretch>
+                      <a:fillRect/>
+                    </a:stretch>
+                  </pic:blipFill>
+                  <pic:spPr bwMode="auto">
+                    <a:xfrm>
+                      <a:off x="0" y="0"/>
+                      <a:ext cx="5334000" cy="3276535"/>
+                    </a:xfrm>
+                    <a:prstGeom prst="rect">
+                      <a:avLst/>
+                    </a:prstGeom>
+                    <a:noFill/>
+                    <a:ln w="9525">
+                      <a:noFill/>
+                      <a:headEnd/>
+                      <a:tailEnd/>
+                    </a:ln>
+                  </pic:spPr>
+                </pic:pic>
+              </a:graphicData>
+            </a:graphic>
+          </wp:inline>
+        </w:drawing>
+      </w:r>
+    </w:p>
+    <w:p>
+      <w:pPr>
+        <w:pStyle w:val="ImageCaption"/>
+      </w:pPr>
+      <w:r>
+        <w:t xml:space="preserve">Banknote — 5-fold cross-validation per-fold accuracy with mean line</w:t>
+      </w:r>
+    </w:p>
+    <w:p>
+      <w:pPr>
+        <w:pStyle w:val="CaptionedFigure"/>
+      </w:pPr>
+      <w:r>
+        <w:drawing>
+          <wp:inline>
+            <wp:extent cx="5334000" cy="3287708"/>
+            <wp:effectExtent b="0" l="0" r="0" t="0"/>
+            <wp:docPr descr="Spambase — 5-fold cross-validation per-fold accuracy with mean line" title="" id="1" name="Picture"/>
+            <a:graphic>
+              <a:graphicData uri="http://schemas.openxmlformats.org/drawingml/2006/picture">
+                <pic:pic>
+                  <pic:nvPicPr>
+                    <pic:cNvPr descr="../figures/spambase_cv_folds.png" id="0" name="Picture"/>
+                    <pic:cNvPicPr>
+                      <a:picLocks noChangeArrowheads="1" noChangeAspect="1"/>
+                    </pic:cNvPicPr>
+                  </pic:nvPicPr>
+                  <pic:blipFill>
+                    <a:blip r:embed="rId38"/>
+                    <a:stretch>
+                      <a:fillRect/>
+                    </a:stretch>
+                  </pic:blipFill>
+                  <pic:spPr bwMode="auto">
+                    <a:xfrm>
+                      <a:off x="0" y="0"/>
+                      <a:ext cx="5334000" cy="3287708"/>
+                    </a:xfrm>
+                    <a:prstGeom prst="rect">
+                      <a:avLst/>
+                    </a:prstGeom>
+                    <a:noFill/>
+                    <a:ln w="9525">
+                      <a:noFill/>
+                      <a:headEnd/>
+                      <a:tailEnd/>
+                    </a:ln>
+                  </pic:spPr>
+                </pic:pic>
+              </a:graphicData>
+            </a:graphic>
+          </wp:inline>
+        </w:drawing>
+      </w:r>
+    </w:p>
+    <w:p>
+      <w:pPr>
+        <w:pStyle w:val="ImageCaption"/>
+      </w:pPr>
+      <w:r>
+        <w:t xml:space="preserve">Spambase — 5-fold cross-validation per-fold accuracy with mean line</w:t>
+      </w:r>
+    </w:p>
+    <w:p>
+      <w:pPr>
         <w:pStyle w:val="Heading4"/>
       </w:pPr>
-      <w:bookmarkStart w:id="36" w:name="baseline-5-fold-cv-default-rbf"/>
+      <w:bookmarkStart w:id="39" w:name="baseline-5-fold-cv-default-rbf"/>
       <w:r>
         <w:t xml:space="preserve">Baseline 5-Fold CV (Default RBF)</w:t>
       </w:r>
-      <w:bookmarkEnd w:id="36"/>
+      <w:bookmarkEnd w:id="39"/>
     </w:p>
     <w:p>
       <w:pPr>
@@ -4849,11 +5067,11 @@
       <w:pPr>
         <w:pStyle w:val="Heading4"/>
       </w:pPr>
-      <w:bookmarkStart w:id="37" w:name="grid-search"/>
+      <w:bookmarkStart w:id="40" w:name="grid-search"/>
       <w:r>
         <w:t xml:space="preserve">Grid Search</w:t>
       </w:r>
-      <w:bookmarkEnd w:id="37"/>
+      <w:bookmarkEnd w:id="40"/>
     </w:p>
     <w:p>
       <w:pPr>
@@ -5515,19 +5733,125 @@
         <w:pStyle w:val="BodyText"/>
       </w:pPr>
       <w:r>
-        <w:t xml:space="preserve">The grid search landscape is visualised as C-versus-γ heatmaps in</w:t>
-      </w:r>
-      <w:r>
-        <w:t xml:space="preserve"> </w:t>
-      </w:r>
-      <w:r>
-        <w:rPr>
-          <w:rStyle w:val="VerbatimChar"/>
-        </w:rPr>
-        <w:t xml:space="preserve">figures/&lt;slug&gt;_grid_search_heatmaps.png</w:t>
-      </w:r>
-      <w:r>
-        <w:t xml:space="preserve">, with the best cell highlighted for each kernel. A practical observation from the grid search trace is that the best</w:t>
+        <w:t xml:space="preserve">The grid search landscape is shown below as C-versus-γ heatmaps, with the best cell highlighted for each kernel.</w:t>
+      </w:r>
+    </w:p>
+    <w:p>
+      <w:pPr>
+        <w:pStyle w:val="CaptionedFigure"/>
+      </w:pPr>
+      <w:r>
+        <w:drawing>
+          <wp:inline>
+            <wp:extent cx="5334000" cy="3701775"/>
+            <wp:effectExtent b="0" l="0" r="0" t="0"/>
+            <wp:docPr descr="Ionosphere — grid search C×γ accuracy heatmaps per kernel" title="" id="1" name="Picture"/>
+            <a:graphic>
+              <a:graphicData uri="http://schemas.openxmlformats.org/drawingml/2006/picture">
+                <pic:pic>
+                  <pic:nvPicPr>
+                    <pic:cNvPr descr="../figures/ionosphere_grid_search_heatmaps.png" id="0" name="Picture"/>
+                    <pic:cNvPicPr>
+                      <a:picLocks noChangeArrowheads="1" noChangeAspect="1"/>
+                    </pic:cNvPicPr>
+                  </pic:nvPicPr>
+                  <pic:blipFill>
+                    <a:blip r:embed="rId41"/>
+                    <a:stretch>
+                      <a:fillRect/>
+                    </a:stretch>
+                  </pic:blipFill>
+                  <pic:spPr bwMode="auto">
+                    <a:xfrm>
+                      <a:off x="0" y="0"/>
+                      <a:ext cx="5334000" cy="3701775"/>
+                    </a:xfrm>
+                    <a:prstGeom prst="rect">
+                      <a:avLst/>
+                    </a:prstGeom>
+                    <a:noFill/>
+                    <a:ln w="9525">
+                      <a:noFill/>
+                      <a:headEnd/>
+                      <a:tailEnd/>
+                    </a:ln>
+                  </pic:spPr>
+                </pic:pic>
+              </a:graphicData>
+            </a:graphic>
+          </wp:inline>
+        </w:drawing>
+      </w:r>
+    </w:p>
+    <w:p>
+      <w:pPr>
+        <w:pStyle w:val="ImageCaption"/>
+      </w:pPr>
+      <w:r>
+        <w:t xml:space="preserve">Ionosphere — grid search C×γ accuracy heatmaps per kernel</w:t>
+      </w:r>
+    </w:p>
+    <w:p>
+      <w:pPr>
+        <w:pStyle w:val="CaptionedFigure"/>
+      </w:pPr>
+      <w:r>
+        <w:drawing>
+          <wp:inline>
+            <wp:extent cx="5334000" cy="3701775"/>
+            <wp:effectExtent b="0" l="0" r="0" t="0"/>
+            <wp:docPr descr="Banknote — grid search C×γ accuracy heatmaps per kernel" title="" id="1" name="Picture"/>
+            <a:graphic>
+              <a:graphicData uri="http://schemas.openxmlformats.org/drawingml/2006/picture">
+                <pic:pic>
+                  <pic:nvPicPr>
+                    <pic:cNvPr descr="../figures/banknote_grid_search_heatmaps.png" id="0" name="Picture"/>
+                    <pic:cNvPicPr>
+                      <a:picLocks noChangeArrowheads="1" noChangeAspect="1"/>
+                    </pic:cNvPicPr>
+                  </pic:nvPicPr>
+                  <pic:blipFill>
+                    <a:blip r:embed="rId42"/>
+                    <a:stretch>
+                      <a:fillRect/>
+                    </a:stretch>
+                  </pic:blipFill>
+                  <pic:spPr bwMode="auto">
+                    <a:xfrm>
+                      <a:off x="0" y="0"/>
+                      <a:ext cx="5334000" cy="3701775"/>
+                    </a:xfrm>
+                    <a:prstGeom prst="rect">
+                      <a:avLst/>
+                    </a:prstGeom>
+                    <a:noFill/>
+                    <a:ln w="9525">
+                      <a:noFill/>
+                      <a:headEnd/>
+                      <a:tailEnd/>
+                    </a:ln>
+                  </pic:spPr>
+                </pic:pic>
+              </a:graphicData>
+            </a:graphic>
+          </wp:inline>
+        </w:drawing>
+      </w:r>
+    </w:p>
+    <w:p>
+      <w:pPr>
+        <w:pStyle w:val="ImageCaption"/>
+      </w:pPr>
+      <w:r>
+        <w:t xml:space="preserve">Banknote — grid search C×γ accuracy heatmaps per kernel</w:t>
+      </w:r>
+    </w:p>
+    <w:p>
+      <w:pPr>
+        <w:pStyle w:val="BodyText"/>
+      </w:pPr>
+      <w:r>
+        <w:t xml:space="preserve">A practical observation from the grid search trace is that the best</w:t>
       </w:r>
       <w:r>
         <w:t xml:space="preserve"> </w:t>
@@ -5597,17 +5921,17 @@
       <w:pPr>
         <w:pStyle w:val="Heading3"/>
       </w:pPr>
-      <w:bookmarkStart w:id="38" w:name="results"/>
+      <w:bookmarkStart w:id="43" w:name="results"/>
       <w:r>
         <w:t xml:space="preserve">1.5 Results</w:t>
       </w:r>
-      <w:bookmarkEnd w:id="38"/>
+      <w:bookmarkEnd w:id="43"/>
     </w:p>
     <w:p>
       <w:pPr>
         <w:pStyle w:val="Heading4"/>
       </w:pPr>
-      <w:bookmarkStart w:id="39" w:name="default-parameters-c-1.0-γ-0.1"/>
+      <w:bookmarkStart w:id="44" w:name="default-parameters-c-1.0-γ-0.1"/>
       <w:r>
         <w:t xml:space="preserve">Default Parameters (</w:t>
       </w:r>
@@ -5632,29 +5956,179 @@
       <w:r>
         <w:t xml:space="preserve">)</w:t>
       </w:r>
-      <w:bookmarkEnd w:id="39"/>
+      <w:bookmarkEnd w:id="44"/>
     </w:p>
     <w:p>
       <w:pPr>
         <w:pStyle w:val="FirstParagraph"/>
       </w:pPr>
       <w:r>
-        <w:t xml:space="preserve">The first comparison is between the three kernels with the same default hyperparameters across all three datasets. This is intentionally not a competitive setting — the point is to establish a baseline against which the §1.4 grid search can be judged. See</w:t>
-      </w:r>
-      <w:r>
-        <w:t xml:space="preserve"> </w:t>
-      </w:r>
-      <w:r>
-        <w:rPr>
-          <w:rStyle w:val="VerbatimChar"/>
-        </w:rPr>
-        <w:t xml:space="preserve">figures/&lt;slug&gt;_kernel_comparison_default.png</w:t>
-      </w:r>
-      <w:r>
-        <w:t xml:space="preserve"> </w:t>
-      </w:r>
-      <w:r>
-        <w:t xml:space="preserve">for the per-dataset visual comparison.</w:t>
+        <w:t xml:space="preserve">The first comparison is between the three kernels with the same default hyperparameters across all three datasets. This is intentionally not a competitive setting — the point is to establish a baseline against which the §1.4 grid search can be judged.</w:t>
+      </w:r>
+    </w:p>
+    <w:p>
+      <w:pPr>
+        <w:pStyle w:val="CaptionedFigure"/>
+      </w:pPr>
+      <w:r>
+        <w:drawing>
+          <wp:inline>
+            <wp:extent cx="5334000" cy="3161291"/>
+            <wp:effectExtent b="0" l="0" r="0" t="0"/>
+            <wp:docPr descr="Ionosphere — kernel comparison at default hyperparameters (accuracy / precision / recall / F1)" title="" id="1" name="Picture"/>
+            <a:graphic>
+              <a:graphicData uri="http://schemas.openxmlformats.org/drawingml/2006/picture">
+                <pic:pic>
+                  <pic:nvPicPr>
+                    <pic:cNvPr descr="../figures/ionosphere_kernel_comparison_default.png" id="0" name="Picture"/>
+                    <pic:cNvPicPr>
+                      <a:picLocks noChangeArrowheads="1" noChangeAspect="1"/>
+                    </pic:cNvPicPr>
+                  </pic:nvPicPr>
+                  <pic:blipFill>
+                    <a:blip r:embed="rId45"/>
+                    <a:stretch>
+                      <a:fillRect/>
+                    </a:stretch>
+                  </pic:blipFill>
+                  <pic:spPr bwMode="auto">
+                    <a:xfrm>
+                      <a:off x="0" y="0"/>
+                      <a:ext cx="5334000" cy="3161291"/>
+                    </a:xfrm>
+                    <a:prstGeom prst="rect">
+                      <a:avLst/>
+                    </a:prstGeom>
+                    <a:noFill/>
+                    <a:ln w="9525">
+                      <a:noFill/>
+                      <a:headEnd/>
+                      <a:tailEnd/>
+                    </a:ln>
+                  </pic:spPr>
+                </pic:pic>
+              </a:graphicData>
+            </a:graphic>
+          </wp:inline>
+        </w:drawing>
+      </w:r>
+    </w:p>
+    <w:p>
+      <w:pPr>
+        <w:pStyle w:val="ImageCaption"/>
+      </w:pPr>
+      <w:r>
+        <w:t xml:space="preserve">Ionosphere — kernel comparison at default hyperparameters (accuracy / precision / recall / F1)</w:t>
+      </w:r>
+    </w:p>
+    <w:p>
+      <w:pPr>
+        <w:pStyle w:val="CaptionedFigure"/>
+      </w:pPr>
+      <w:r>
+        <w:drawing>
+          <wp:inline>
+            <wp:extent cx="5334000" cy="3161291"/>
+            <wp:effectExtent b="0" l="0" r="0" t="0"/>
+            <wp:docPr descr="Banknote — kernel comparison at default hyperparameters" title="" id="1" name="Picture"/>
+            <a:graphic>
+              <a:graphicData uri="http://schemas.openxmlformats.org/drawingml/2006/picture">
+                <pic:pic>
+                  <pic:nvPicPr>
+                    <pic:cNvPr descr="../figures/banknote_kernel_comparison_default.png" id="0" name="Picture"/>
+                    <pic:cNvPicPr>
+                      <a:picLocks noChangeArrowheads="1" noChangeAspect="1"/>
+                    </pic:cNvPicPr>
+                  </pic:nvPicPr>
+                  <pic:blipFill>
+                    <a:blip r:embed="rId46"/>
+                    <a:stretch>
+                      <a:fillRect/>
+                    </a:stretch>
+                  </pic:blipFill>
+                  <pic:spPr bwMode="auto">
+                    <a:xfrm>
+                      <a:off x="0" y="0"/>
+                      <a:ext cx="5334000" cy="3161291"/>
+                    </a:xfrm>
+                    <a:prstGeom prst="rect">
+                      <a:avLst/>
+                    </a:prstGeom>
+                    <a:noFill/>
+                    <a:ln w="9525">
+                      <a:noFill/>
+                      <a:headEnd/>
+                      <a:tailEnd/>
+                    </a:ln>
+                  </pic:spPr>
+                </pic:pic>
+              </a:graphicData>
+            </a:graphic>
+          </wp:inline>
+        </w:drawing>
+      </w:r>
+    </w:p>
+    <w:p>
+      <w:pPr>
+        <w:pStyle w:val="ImageCaption"/>
+      </w:pPr>
+      <w:r>
+        <w:t xml:space="preserve">Banknote — kernel comparison at default hyperparameters</w:t>
+      </w:r>
+    </w:p>
+    <w:p>
+      <w:pPr>
+        <w:pStyle w:val="CaptionedFigure"/>
+      </w:pPr>
+      <w:r>
+        <w:drawing>
+          <wp:inline>
+            <wp:extent cx="5334000" cy="3161291"/>
+            <wp:effectExtent b="0" l="0" r="0" t="0"/>
+            <wp:docPr descr="Spambase — kernel comparison at default hyperparameters" title="" id="1" name="Picture"/>
+            <a:graphic>
+              <a:graphicData uri="http://schemas.openxmlformats.org/drawingml/2006/picture">
+                <pic:pic>
+                  <pic:nvPicPr>
+                    <pic:cNvPr descr="../figures/spambase_kernel_comparison_default.png" id="0" name="Picture"/>
+                    <pic:cNvPicPr>
+                      <a:picLocks noChangeArrowheads="1" noChangeAspect="1"/>
+                    </pic:cNvPicPr>
+                  </pic:nvPicPr>
+                  <pic:blipFill>
+                    <a:blip r:embed="rId47"/>
+                    <a:stretch>
+                      <a:fillRect/>
+                    </a:stretch>
+                  </pic:blipFill>
+                  <pic:spPr bwMode="auto">
+                    <a:xfrm>
+                      <a:off x="0" y="0"/>
+                      <a:ext cx="5334000" cy="3161291"/>
+                    </a:xfrm>
+                    <a:prstGeom prst="rect">
+                      <a:avLst/>
+                    </a:prstGeom>
+                    <a:noFill/>
+                    <a:ln w="9525">
+                      <a:noFill/>
+                      <a:headEnd/>
+                      <a:tailEnd/>
+                    </a:ln>
+                  </pic:spPr>
+                </pic:pic>
+              </a:graphicData>
+            </a:graphic>
+          </wp:inline>
+        </w:drawing>
+      </w:r>
+    </w:p>
+    <w:p>
+      <w:pPr>
+        <w:pStyle w:val="ImageCaption"/>
+      </w:pPr>
+      <w:r>
+        <w:t xml:space="preserve">Spambase — kernel comparison at default hyperparameters</w:t>
       </w:r>
     </w:p>
     <w:tbl>
@@ -6496,11 +6970,11 @@
       <w:pPr>
         <w:pStyle w:val="Heading4"/>
       </w:pPr>
-      <w:bookmarkStart w:id="40" w:name="optimised-parameters"/>
+      <w:bookmarkStart w:id="48" w:name="optimised-parameters"/>
       <w:r>
         <w:t xml:space="preserve">Optimised Parameters</w:t>
       </w:r>
-      <w:bookmarkEnd w:id="40"/>
+      <w:bookmarkEnd w:id="48"/>
     </w:p>
     <w:p>
       <w:pPr>
@@ -7639,42 +8113,238 @@
         <w:pStyle w:val="FirstParagraph"/>
       </w:pPr>
       <w:r>
-        <w:t xml:space="preserve">The optimised-parameter visual comparison is in</w:t>
-      </w:r>
-      <w:r>
-        <w:t xml:space="preserve"> </w:t>
-      </w:r>
-      <w:r>
-        <w:rPr>
-          <w:rStyle w:val="VerbatimChar"/>
-        </w:rPr>
-        <w:t xml:space="preserve">figures/&lt;slug&gt;_kernel_comparison_optimised.png</w:t>
-      </w:r>
-      <w:r>
-        <w:t xml:space="preserve">, and the side-by-side default-vs-optimised accuracy chart is in</w:t>
-      </w:r>
-      <w:r>
-        <w:t xml:space="preserve"> </w:t>
-      </w:r>
-      <w:r>
-        <w:rPr>
-          <w:rStyle w:val="VerbatimChar"/>
-        </w:rPr>
-        <w:t xml:space="preserve">figures/&lt;slug&gt;_default_vs_optimised.png</w:t>
-      </w:r>
-      <w:r>
-        <w:t xml:space="preserve">.</w:t>
+        <w:t xml:space="preserve">The optimised-parameter visual comparison and the side-by-side default-vs-optimised accuracy chart for each dataset where grid search ran are shown below.</w:t>
+      </w:r>
+    </w:p>
+    <w:p>
+      <w:pPr>
+        <w:pStyle w:val="CaptionedFigure"/>
+      </w:pPr>
+      <w:r>
+        <w:drawing>
+          <wp:inline>
+            <wp:extent cx="5334000" cy="3161291"/>
+            <wp:effectExtent b="0" l="0" r="0" t="0"/>
+            <wp:docPr descr="Ionosphere — kernel comparison at optimised hyperparameters" title="" id="1" name="Picture"/>
+            <a:graphic>
+              <a:graphicData uri="http://schemas.openxmlformats.org/drawingml/2006/picture">
+                <pic:pic>
+                  <pic:nvPicPr>
+                    <pic:cNvPr descr="../figures/ionosphere_kernel_comparison_optimised.png" id="0" name="Picture"/>
+                    <pic:cNvPicPr>
+                      <a:picLocks noChangeArrowheads="1" noChangeAspect="1"/>
+                    </pic:cNvPicPr>
+                  </pic:nvPicPr>
+                  <pic:blipFill>
+                    <a:blip r:embed="rId49"/>
+                    <a:stretch>
+                      <a:fillRect/>
+                    </a:stretch>
+                  </pic:blipFill>
+                  <pic:spPr bwMode="auto">
+                    <a:xfrm>
+                      <a:off x="0" y="0"/>
+                      <a:ext cx="5334000" cy="3161291"/>
+                    </a:xfrm>
+                    <a:prstGeom prst="rect">
+                      <a:avLst/>
+                    </a:prstGeom>
+                    <a:noFill/>
+                    <a:ln w="9525">
+                      <a:noFill/>
+                      <a:headEnd/>
+                      <a:tailEnd/>
+                    </a:ln>
+                  </pic:spPr>
+                </pic:pic>
+              </a:graphicData>
+            </a:graphic>
+          </wp:inline>
+        </w:drawing>
+      </w:r>
+    </w:p>
+    <w:p>
+      <w:pPr>
+        <w:pStyle w:val="ImageCaption"/>
+      </w:pPr>
+      <w:r>
+        <w:t xml:space="preserve">Ionosphere — kernel comparison at optimised hyperparameters</w:t>
+      </w:r>
+    </w:p>
+    <w:p>
+      <w:pPr>
+        <w:pStyle w:val="CaptionedFigure"/>
+      </w:pPr>
+      <w:r>
+        <w:drawing>
+          <wp:inline>
+            <wp:extent cx="5334000" cy="3161291"/>
+            <wp:effectExtent b="0" l="0" r="0" t="0"/>
+            <wp:docPr descr="Banknote — kernel comparison at optimised hyperparameters" title="" id="1" name="Picture"/>
+            <a:graphic>
+              <a:graphicData uri="http://schemas.openxmlformats.org/drawingml/2006/picture">
+                <pic:pic>
+                  <pic:nvPicPr>
+                    <pic:cNvPr descr="../figures/banknote_kernel_comparison_optimised.png" id="0" name="Picture"/>
+                    <pic:cNvPicPr>
+                      <a:picLocks noChangeArrowheads="1" noChangeAspect="1"/>
+                    </pic:cNvPicPr>
+                  </pic:nvPicPr>
+                  <pic:blipFill>
+                    <a:blip r:embed="rId50"/>
+                    <a:stretch>
+                      <a:fillRect/>
+                    </a:stretch>
+                  </pic:blipFill>
+                  <pic:spPr bwMode="auto">
+                    <a:xfrm>
+                      <a:off x="0" y="0"/>
+                      <a:ext cx="5334000" cy="3161291"/>
+                    </a:xfrm>
+                    <a:prstGeom prst="rect">
+                      <a:avLst/>
+                    </a:prstGeom>
+                    <a:noFill/>
+                    <a:ln w="9525">
+                      <a:noFill/>
+                      <a:headEnd/>
+                      <a:tailEnd/>
+                    </a:ln>
+                  </pic:spPr>
+                </pic:pic>
+              </a:graphicData>
+            </a:graphic>
+          </wp:inline>
+        </w:drawing>
+      </w:r>
+    </w:p>
+    <w:p>
+      <w:pPr>
+        <w:pStyle w:val="ImageCaption"/>
+      </w:pPr>
+      <w:r>
+        <w:t xml:space="preserve">Banknote — kernel comparison at optimised hyperparameters</w:t>
+      </w:r>
+    </w:p>
+    <w:p>
+      <w:pPr>
+        <w:pStyle w:val="CaptionedFigure"/>
+      </w:pPr>
+      <w:r>
+        <w:drawing>
+          <wp:inline>
+            <wp:extent cx="5334000" cy="3519714"/>
+            <wp:effectExtent b="0" l="0" r="0" t="0"/>
+            <wp:docPr descr="Ionosphere — default vs optimised accuracy per kernel" title="" id="1" name="Picture"/>
+            <a:graphic>
+              <a:graphicData uri="http://schemas.openxmlformats.org/drawingml/2006/picture">
+                <pic:pic>
+                  <pic:nvPicPr>
+                    <pic:cNvPr descr="../figures/ionosphere_default_vs_optimised.png" id="0" name="Picture"/>
+                    <pic:cNvPicPr>
+                      <a:picLocks noChangeArrowheads="1" noChangeAspect="1"/>
+                    </pic:cNvPicPr>
+                  </pic:nvPicPr>
+                  <pic:blipFill>
+                    <a:blip r:embed="rId51"/>
+                    <a:stretch>
+                      <a:fillRect/>
+                    </a:stretch>
+                  </pic:blipFill>
+                  <pic:spPr bwMode="auto">
+                    <a:xfrm>
+                      <a:off x="0" y="0"/>
+                      <a:ext cx="5334000" cy="3519714"/>
+                    </a:xfrm>
+                    <a:prstGeom prst="rect">
+                      <a:avLst/>
+                    </a:prstGeom>
+                    <a:noFill/>
+                    <a:ln w="9525">
+                      <a:noFill/>
+                      <a:headEnd/>
+                      <a:tailEnd/>
+                    </a:ln>
+                  </pic:spPr>
+                </pic:pic>
+              </a:graphicData>
+            </a:graphic>
+          </wp:inline>
+        </w:drawing>
+      </w:r>
+    </w:p>
+    <w:p>
+      <w:pPr>
+        <w:pStyle w:val="ImageCaption"/>
+      </w:pPr>
+      <w:r>
+        <w:t xml:space="preserve">Ionosphere — default vs optimised accuracy per kernel</w:t>
+      </w:r>
+    </w:p>
+    <w:p>
+      <w:pPr>
+        <w:pStyle w:val="CaptionedFigure"/>
+      </w:pPr>
+      <w:r>
+        <w:drawing>
+          <wp:inline>
+            <wp:extent cx="5334000" cy="3519714"/>
+            <wp:effectExtent b="0" l="0" r="0" t="0"/>
+            <wp:docPr descr="Banknote — default vs optimised accuracy per kernel" title="" id="1" name="Picture"/>
+            <a:graphic>
+              <a:graphicData uri="http://schemas.openxmlformats.org/drawingml/2006/picture">
+                <pic:pic>
+                  <pic:nvPicPr>
+                    <pic:cNvPr descr="../figures/banknote_default_vs_optimised.png" id="0" name="Picture"/>
+                    <pic:cNvPicPr>
+                      <a:picLocks noChangeArrowheads="1" noChangeAspect="1"/>
+                    </pic:cNvPicPr>
+                  </pic:nvPicPr>
+                  <pic:blipFill>
+                    <a:blip r:embed="rId52"/>
+                    <a:stretch>
+                      <a:fillRect/>
+                    </a:stretch>
+                  </pic:blipFill>
+                  <pic:spPr bwMode="auto">
+                    <a:xfrm>
+                      <a:off x="0" y="0"/>
+                      <a:ext cx="5334000" cy="3519714"/>
+                    </a:xfrm>
+                    <a:prstGeom prst="rect">
+                      <a:avLst/>
+                    </a:prstGeom>
+                    <a:noFill/>
+                    <a:ln w="9525">
+                      <a:noFill/>
+                      <a:headEnd/>
+                      <a:tailEnd/>
+                    </a:ln>
+                  </pic:spPr>
+                </pic:pic>
+              </a:graphicData>
+            </a:graphic>
+          </wp:inline>
+        </w:drawing>
+      </w:r>
+    </w:p>
+    <w:p>
+      <w:pPr>
+        <w:pStyle w:val="ImageCaption"/>
+      </w:pPr>
+      <w:r>
+        <w:t xml:space="preserve">Banknote — default vs optimised accuracy per kernel</w:t>
       </w:r>
     </w:p>
     <w:p>
       <w:pPr>
         <w:pStyle w:val="Heading4"/>
       </w:pPr>
-      <w:bookmarkStart w:id="41" w:name="per-dataset-discussion"/>
+      <w:bookmarkStart w:id="53" w:name="per-dataset-discussion"/>
       <w:r>
         <w:t xml:space="preserve">Per-Dataset Discussion</w:t>
       </w:r>
-      <w:bookmarkEnd w:id="41"/>
+      <w:bookmarkEnd w:id="53"/>
     </w:p>
     <w:p>
       <w:pPr>
@@ -7833,11 +8503,11 @@
       <w:pPr>
         <w:pStyle w:val="Heading4"/>
       </w:pPr>
-      <w:bookmarkStart w:id="42" w:name="confusion-matrices-for-the-best-models"/>
+      <w:bookmarkStart w:id="54" w:name="confusion-matrices-for-the-best-models"/>
       <w:r>
         <w:t xml:space="preserve">Confusion Matrices for the Best Models</w:t>
       </w:r>
-      <w:bookmarkEnd w:id="42"/>
+      <w:bookmarkEnd w:id="54"/>
     </w:p>
     <w:p>
       <w:pPr>
@@ -8348,19 +9018,117 @@
         <w:pStyle w:val="BodyText"/>
       </w:pPr>
       <w:r>
-        <w:t xml:space="preserve">Confusion matrices for all four models per dataset (initial RBF baseline plus the three optimised kernels, where applicable) are visualised in</w:t>
-      </w:r>
-      <w:r>
-        <w:t xml:space="preserve"> </w:t>
-      </w:r>
-      <w:r>
-        <w:rPr>
-          <w:rStyle w:val="VerbatimChar"/>
-        </w:rPr>
-        <w:t xml:space="preserve">figures/&lt;slug&gt;_confusion_matrices.png</w:t>
-      </w:r>
-      <w:r>
-        <w:t xml:space="preserve">.</w:t>
+        <w:t xml:space="preserve">Confusion matrices for the initial RBF baseline alongside the three optimised kernels (Ionosphere and Banknote only — Spambase has no optimised models) are shown below.</w:t>
+      </w:r>
+    </w:p>
+    <w:p>
+      <w:pPr>
+        <w:pStyle w:val="CaptionedFigure"/>
+      </w:pPr>
+      <w:r>
+        <w:drawing>
+          <wp:inline>
+            <wp:extent cx="5334000" cy="1377566"/>
+            <wp:effectExtent b="0" l="0" r="0" t="0"/>
+            <wp:docPr descr="Ionosphere — confusion matrices for initial RBF and the three optimised kernels" title="" id="1" name="Picture"/>
+            <a:graphic>
+              <a:graphicData uri="http://schemas.openxmlformats.org/drawingml/2006/picture">
+                <pic:pic>
+                  <pic:nvPicPr>
+                    <pic:cNvPr descr="../figures/ionosphere_confusion_matrices.png" id="0" name="Picture"/>
+                    <pic:cNvPicPr>
+                      <a:picLocks noChangeArrowheads="1" noChangeAspect="1"/>
+                    </pic:cNvPicPr>
+                  </pic:nvPicPr>
+                  <pic:blipFill>
+                    <a:blip r:embed="rId55"/>
+                    <a:stretch>
+                      <a:fillRect/>
+                    </a:stretch>
+                  </pic:blipFill>
+                  <pic:spPr bwMode="auto">
+                    <a:xfrm>
+                      <a:off x="0" y="0"/>
+                      <a:ext cx="5334000" cy="1377566"/>
+                    </a:xfrm>
+                    <a:prstGeom prst="rect">
+                      <a:avLst/>
+                    </a:prstGeom>
+                    <a:noFill/>
+                    <a:ln w="9525">
+                      <a:noFill/>
+                      <a:headEnd/>
+                      <a:tailEnd/>
+                    </a:ln>
+                  </pic:spPr>
+                </pic:pic>
+              </a:graphicData>
+            </a:graphic>
+          </wp:inline>
+        </w:drawing>
+      </w:r>
+    </w:p>
+    <w:p>
+      <w:pPr>
+        <w:pStyle w:val="ImageCaption"/>
+      </w:pPr>
+      <w:r>
+        <w:t xml:space="preserve">Ionosphere — confusion matrices for initial RBF and the three optimised kernels</w:t>
+      </w:r>
+    </w:p>
+    <w:p>
+      <w:pPr>
+        <w:pStyle w:val="CaptionedFigure"/>
+      </w:pPr>
+      <w:r>
+        <w:drawing>
+          <wp:inline>
+            <wp:extent cx="5334000" cy="1377566"/>
+            <wp:effectExtent b="0" l="0" r="0" t="0"/>
+            <wp:docPr descr="Banknote — confusion matrices for initial RBF and the three optimised kernels" title="" id="1" name="Picture"/>
+            <a:graphic>
+              <a:graphicData uri="http://schemas.openxmlformats.org/drawingml/2006/picture">
+                <pic:pic>
+                  <pic:nvPicPr>
+                    <pic:cNvPr descr="../figures/banknote_confusion_matrices.png" id="0" name="Picture"/>
+                    <pic:cNvPicPr>
+                      <a:picLocks noChangeArrowheads="1" noChangeAspect="1"/>
+                    </pic:cNvPicPr>
+                  </pic:nvPicPr>
+                  <pic:blipFill>
+                    <a:blip r:embed="rId56"/>
+                    <a:stretch>
+                      <a:fillRect/>
+                    </a:stretch>
+                  </pic:blipFill>
+                  <pic:spPr bwMode="auto">
+                    <a:xfrm>
+                      <a:off x="0" y="0"/>
+                      <a:ext cx="5334000" cy="1377566"/>
+                    </a:xfrm>
+                    <a:prstGeom prst="rect">
+                      <a:avLst/>
+                    </a:prstGeom>
+                    <a:noFill/>
+                    <a:ln w="9525">
+                      <a:noFill/>
+                      <a:headEnd/>
+                      <a:tailEnd/>
+                    </a:ln>
+                  </pic:spPr>
+                </pic:pic>
+              </a:graphicData>
+            </a:graphic>
+          </wp:inline>
+        </w:drawing>
+      </w:r>
+    </w:p>
+    <w:p>
+      <w:pPr>
+        <w:pStyle w:val="ImageCaption"/>
+      </w:pPr>
+      <w:r>
+        <w:t xml:space="preserve">Banknote — confusion matrices for initial RBF and the three optimised kernels</w:t>
       </w:r>
     </w:p>
     <w:p>
@@ -8374,21 +9142,21 @@
       <w:pPr>
         <w:pStyle w:val="Heading2"/>
       </w:pPr>
-      <w:bookmarkStart w:id="43" w:name="task-2-discussion"/>
+      <w:bookmarkStart w:id="57" w:name="task-2-discussion"/>
       <w:r>
         <w:t xml:space="preserve">Task 2: Discussion</w:t>
       </w:r>
-      <w:bookmarkEnd w:id="43"/>
+      <w:bookmarkEnd w:id="57"/>
     </w:p>
     <w:p>
       <w:pPr>
         <w:pStyle w:val="Heading3"/>
       </w:pPr>
-      <w:bookmarkStart w:id="44" w:name="ability-of-the-svm-algorithm"/>
+      <w:bookmarkStart w:id="58" w:name="ability-of-the-svm-algorithm"/>
       <w:r>
         <w:t xml:space="preserve">2.1 Ability of the SVM Algorithm</w:t>
       </w:r>
-      <w:bookmarkEnd w:id="44"/>
+      <w:bookmarkEnd w:id="58"/>
     </w:p>
     <w:p>
       <w:pPr>
@@ -8713,11 +9481,11 @@
       <w:pPr>
         <w:pStyle w:val="Heading3"/>
       </w:pPr>
-      <w:bookmarkStart w:id="45" w:name="limitations-of-the-svm-algorithm"/>
+      <w:bookmarkStart w:id="59" w:name="limitations-of-the-svm-algorithm"/>
       <w:r>
         <w:t xml:space="preserve">2.2 Limitations of the SVM Algorithm</w:t>
       </w:r>
-      <w:bookmarkEnd w:id="45"/>
+      <w:bookmarkEnd w:id="59"/>
     </w:p>
     <w:p>
       <w:pPr>
@@ -9164,11 +9932,11 @@
       <w:pPr>
         <w:pStyle w:val="Heading3"/>
       </w:pPr>
-      <w:bookmarkStart w:id="46" w:name="real-world-applications"/>
+      <w:bookmarkStart w:id="60" w:name="real-world-applications"/>
       <w:r>
         <w:t xml:space="preserve">2.3 Real-World Applications</w:t>
       </w:r>
-      <w:bookmarkEnd w:id="46"/>
+      <w:bookmarkEnd w:id="60"/>
     </w:p>
     <w:p>
       <w:pPr>
@@ -9192,7 +9960,7 @@
         <w:t xml:space="preserve"> </w:t>
       </w:r>
       <w:r>
-        <w:t xml:space="preserve">SVMs were the dominant algorithm for text classification before the rise of deep learning, and they remain competitive on small-corpus problems. Spam detection (the application Spambase models), sentiment analysis, language identification, and document categorisation are all classical SVM applications. Text data is naturally represented as high-dimensional sparse vectors (bag-of-words, TF-IDF), and Linear SVMs handle this representation extremely efficiently — sparse kernel evaluation is fast, and the resulting models are compact. For many production text-classification systems with limited training data, a Linear SVM trained with</w:t>
+        <w:t xml:space="preserve">SVMs were the dominant algorithm for text classification before the rise of deep learning (Joachims, 1998), and they remain competitive on small-corpus problems. Spam detection (the application Spambase models), sentiment analysis, language identification, and document categorisation are all classical SVM applications. Text data is naturally represented as high-dimensional sparse vectors (bag-of-words, TF-IDF), and Linear SVMs handle this representation extremely efficiently — sparse kernel evaluation is fast, and the resulting models are compact. For many production text-classification systems with limited training data, a Linear SVM trained with</w:t>
       </w:r>
       <w:r>
         <w:t xml:space="preserve"> </w:t>
@@ -9371,11 +10139,11 @@
       <w:pPr>
         <w:pStyle w:val="Heading2"/>
       </w:pPr>
-      <w:bookmarkStart w:id="47" w:name="references"/>
+      <w:bookmarkStart w:id="61" w:name="references"/>
       <w:r>
         <w:t xml:space="preserve">References</w:t>
       </w:r>
-      <w:bookmarkEnd w:id="47"/>
+      <w:bookmarkEnd w:id="61"/>
     </w:p>
     <w:p>
       <w:pPr>
@@ -9592,21 +10360,21 @@
       <w:pPr>
         <w:pStyle w:val="Heading2"/>
       </w:pPr>
-      <w:bookmarkStart w:id="48" w:name="further-reading-links-by-report-section"/>
+      <w:bookmarkStart w:id="62" w:name="further-reading-links-by-report-section"/>
       <w:r>
         <w:t xml:space="preserve">Further Reading — Links by Report Section</w:t>
       </w:r>
-      <w:bookmarkEnd w:id="48"/>
+      <w:bookmarkEnd w:id="62"/>
     </w:p>
     <w:p>
       <w:pPr>
         <w:pStyle w:val="Heading3"/>
       </w:pPr>
-      <w:bookmarkStart w:id="49" w:name="task-1-description-of-program"/>
+      <w:bookmarkStart w:id="63" w:name="task-1-description-of-program"/>
       <w:r>
         <w:t xml:space="preserve">Task 1: Description of Program</w:t>
       </w:r>
-      <w:bookmarkEnd w:id="49"/>
+      <w:bookmarkEnd w:id="63"/>
     </w:p>
     <w:p>
       <w:pPr>
@@ -9616,7 +10384,7 @@
         </w:numPr>
         <w:pStyle w:val="Compact"/>
       </w:pPr>
-      <w:hyperlink r:id="rId50">
+      <w:hyperlink r:id="rId64">
         <w:r>
           <w:rPr>
             <w:rStyle w:val="Hyperlink"/>
@@ -9633,7 +10401,7 @@
         </w:numPr>
         <w:pStyle w:val="Compact"/>
       </w:pPr>
-      <w:hyperlink r:id="rId51">
+      <w:hyperlink r:id="rId65">
         <w:r>
           <w:rPr>
             <w:rStyle w:val="Hyperlink"/>
@@ -9650,7 +10418,7 @@
         </w:numPr>
         <w:pStyle w:val="Compact"/>
       </w:pPr>
-      <w:hyperlink r:id="rId52">
+      <w:hyperlink r:id="rId66">
         <w:r>
           <w:rPr>
             <w:rStyle w:val="Hyperlink"/>
@@ -9663,11 +10431,11 @@
       <w:pPr>
         <w:pStyle w:val="Heading3"/>
       </w:pPr>
-      <w:bookmarkStart w:id="53" w:name="task-1-datasets"/>
+      <w:bookmarkStart w:id="67" w:name="task-1-datasets"/>
       <w:r>
         <w:t xml:space="preserve">Task 1: Datasets</w:t>
       </w:r>
-      <w:bookmarkEnd w:id="53"/>
+      <w:bookmarkEnd w:id="67"/>
     </w:p>
     <w:p>
       <w:pPr>
@@ -9677,7 +10445,7 @@
         </w:numPr>
         <w:pStyle w:val="Compact"/>
       </w:pPr>
-      <w:hyperlink r:id="rId54">
+      <w:hyperlink r:id="rId68">
         <w:r>
           <w:rPr>
             <w:rStyle w:val="Hyperlink"/>
@@ -9694,7 +10462,7 @@
         </w:numPr>
         <w:pStyle w:val="Compact"/>
       </w:pPr>
-      <w:hyperlink r:id="rId55">
+      <w:hyperlink r:id="rId69">
         <w:r>
           <w:rPr>
             <w:rStyle w:val="Hyperlink"/>
@@ -9711,7 +10479,7 @@
         </w:numPr>
         <w:pStyle w:val="Compact"/>
       </w:pPr>
-      <w:hyperlink r:id="rId56">
+      <w:hyperlink r:id="rId70">
         <w:r>
           <w:rPr>
             <w:rStyle w:val="Hyperlink"/>
@@ -9724,11 +10492,11 @@
       <w:pPr>
         <w:pStyle w:val="Heading3"/>
       </w:pPr>
-      <w:bookmarkStart w:id="57" w:name="X94de4d63cc7d7277fe3627c496af4df652f8255"/>
+      <w:bookmarkStart w:id="71" w:name="X94de4d63cc7d7277fe3627c496af4df652f8255"/>
       <w:r>
         <w:t xml:space="preserve">Task 1: Algorithm Implementation and Parameters</w:t>
       </w:r>
-      <w:bookmarkEnd w:id="57"/>
+      <w:bookmarkEnd w:id="71"/>
     </w:p>
     <w:p>
       <w:pPr>
@@ -9738,7 +10506,7 @@
         </w:numPr>
         <w:pStyle w:val="Compact"/>
       </w:pPr>
-      <w:hyperlink r:id="rId58">
+      <w:hyperlink r:id="rId72">
         <w:r>
           <w:rPr>
             <w:rStyle w:val="Hyperlink"/>
@@ -9755,7 +10523,7 @@
         </w:numPr>
         <w:pStyle w:val="Compact"/>
       </w:pPr>
-      <w:hyperlink r:id="rId59">
+      <w:hyperlink r:id="rId73">
         <w:r>
           <w:rPr>
             <w:rStyle w:val="Hyperlink"/>
@@ -9772,7 +10540,7 @@
         </w:numPr>
         <w:pStyle w:val="Compact"/>
       </w:pPr>
-      <w:hyperlink r:id="rId51">
+      <w:hyperlink r:id="rId65">
         <w:r>
           <w:rPr>
             <w:rStyle w:val="Hyperlink"/>
@@ -9785,11 +10553,11 @@
       <w:pPr>
         <w:pStyle w:val="Heading3"/>
       </w:pPr>
-      <w:bookmarkStart w:id="60" w:name="task-1-training-of-algorithm"/>
+      <w:bookmarkStart w:id="74" w:name="task-1-training-of-algorithm"/>
       <w:r>
         <w:t xml:space="preserve">Task 1: Training of Algorithm</w:t>
       </w:r>
-      <w:bookmarkEnd w:id="60"/>
+      <w:bookmarkEnd w:id="74"/>
     </w:p>
     <w:p>
       <w:pPr>
@@ -9799,7 +10567,7 @@
         </w:numPr>
         <w:pStyle w:val="Compact"/>
       </w:pPr>
-      <w:hyperlink r:id="rId61">
+      <w:hyperlink r:id="rId75">
         <w:r>
           <w:rPr>
             <w:rStyle w:val="Hyperlink"/>
@@ -9816,7 +10584,7 @@
         </w:numPr>
         <w:pStyle w:val="Compact"/>
       </w:pPr>
-      <w:hyperlink r:id="rId52">
+      <w:hyperlink r:id="rId66">
         <w:r>
           <w:rPr>
             <w:rStyle w:val="Hyperlink"/>
@@ -9829,11 +10597,11 @@
       <w:pPr>
         <w:pStyle w:val="Heading3"/>
       </w:pPr>
-      <w:bookmarkStart w:id="62" w:name="task-1-results"/>
+      <w:bookmarkStart w:id="76" w:name="task-1-results"/>
       <w:r>
         <w:t xml:space="preserve">Task 1: Results</w:t>
       </w:r>
-      <w:bookmarkEnd w:id="62"/>
+      <w:bookmarkEnd w:id="76"/>
     </w:p>
     <w:p>
       <w:pPr>
@@ -9843,7 +10611,7 @@
         </w:numPr>
         <w:pStyle w:val="Compact"/>
       </w:pPr>
-      <w:hyperlink r:id="rId63">
+      <w:hyperlink r:id="rId77">
         <w:r>
           <w:rPr>
             <w:rStyle w:val="Hyperlink"/>
@@ -9860,7 +10628,7 @@
         </w:numPr>
         <w:pStyle w:val="Compact"/>
       </w:pPr>
-      <w:hyperlink r:id="rId64">
+      <w:hyperlink r:id="rId78">
         <w:r>
           <w:rPr>
             <w:rStyle w:val="Hyperlink"/>
@@ -9877,7 +10645,7 @@
         </w:numPr>
         <w:pStyle w:val="Compact"/>
       </w:pPr>
-      <w:hyperlink r:id="rId65">
+      <w:hyperlink r:id="rId79">
         <w:r>
           <w:rPr>
             <w:rStyle w:val="Hyperlink"/>
@@ -9890,11 +10658,11 @@
       <w:pPr>
         <w:pStyle w:val="Heading3"/>
       </w:pPr>
-      <w:bookmarkStart w:id="66" w:name="task-2-ability-of-chosen-algorithm"/>
+      <w:bookmarkStart w:id="80" w:name="task-2-ability-of-chosen-algorithm"/>
       <w:r>
         <w:t xml:space="preserve">Task 2: Ability of Chosen Algorithm</w:t>
       </w:r>
-      <w:bookmarkEnd w:id="66"/>
+      <w:bookmarkEnd w:id="80"/>
     </w:p>
     <w:p>
       <w:pPr>
@@ -9904,7 +10672,7 @@
         </w:numPr>
         <w:pStyle w:val="Compact"/>
       </w:pPr>
-      <w:hyperlink r:id="rId50">
+      <w:hyperlink r:id="rId64">
         <w:r>
           <w:rPr>
             <w:rStyle w:val="Hyperlink"/>
@@ -9921,7 +10689,7 @@
         </w:numPr>
         <w:pStyle w:val="Compact"/>
       </w:pPr>
-      <w:hyperlink r:id="rId52">
+      <w:hyperlink r:id="rId66">
         <w:r>
           <w:rPr>
             <w:rStyle w:val="Hyperlink"/>
@@ -9934,11 +10702,11 @@
       <w:pPr>
         <w:pStyle w:val="Heading3"/>
       </w:pPr>
-      <w:bookmarkStart w:id="67" w:name="task-2-limitations-of-chosen-algorithm"/>
+      <w:bookmarkStart w:id="81" w:name="task-2-limitations-of-chosen-algorithm"/>
       <w:r>
         <w:t xml:space="preserve">Task 2: Limitations of Chosen Algorithm</w:t>
       </w:r>
-      <w:bookmarkEnd w:id="67"/>
+      <w:bookmarkEnd w:id="81"/>
     </w:p>
     <w:p>
       <w:pPr>
@@ -9948,7 +10716,7 @@
         </w:numPr>
         <w:pStyle w:val="Compact"/>
       </w:pPr>
-      <w:hyperlink r:id="rId50">
+      <w:hyperlink r:id="rId64">
         <w:r>
           <w:rPr>
             <w:rStyle w:val="Hyperlink"/>
@@ -9965,7 +10733,7 @@
         </w:numPr>
         <w:pStyle w:val="Compact"/>
       </w:pPr>
-      <w:hyperlink r:id="rId52">
+      <w:hyperlink r:id="rId66">
         <w:r>
           <w:rPr>
             <w:rStyle w:val="Hyperlink"/>
@@ -9982,7 +10750,7 @@
         </w:numPr>
         <w:pStyle w:val="Compact"/>
       </w:pPr>
-      <w:hyperlink r:id="rId68">
+      <w:hyperlink r:id="rId82">
         <w:r>
           <w:rPr>
             <w:rStyle w:val="Hyperlink"/>
@@ -9995,11 +10763,11 @@
       <w:pPr>
         <w:pStyle w:val="Heading3"/>
       </w:pPr>
-      <w:bookmarkStart w:id="69" w:name="task-2-uses-of-chosen-algorithm"/>
+      <w:bookmarkStart w:id="83" w:name="task-2-uses-of-chosen-algorithm"/>
       <w:r>
         <w:t xml:space="preserve">Task 2: Uses of Chosen Algorithm</w:t>
       </w:r>
-      <w:bookmarkEnd w:id="69"/>
+      <w:bookmarkEnd w:id="83"/>
     </w:p>
     <w:p>
       <w:pPr>
@@ -10009,7 +10777,7 @@
         </w:numPr>
         <w:pStyle w:val="Compact"/>
       </w:pPr>
-      <w:hyperlink r:id="rId50">
+      <w:hyperlink r:id="rId64">
         <w:r>
           <w:rPr>
             <w:rStyle w:val="Hyperlink"/>
@@ -10026,7 +10794,7 @@
         </w:numPr>
         <w:pStyle w:val="Compact"/>
       </w:pPr>
-      <w:hyperlink r:id="rId70">
+      <w:hyperlink r:id="rId84">
         <w:r>
           <w:rPr>
             <w:rStyle w:val="Hyperlink"/>
@@ -10043,7 +10811,7 @@
         </w:numPr>
         <w:pStyle w:val="Compact"/>
       </w:pPr>
-      <w:hyperlink r:id="rId55">
+      <w:hyperlink r:id="rId69">
         <w:r>
           <w:rPr>
             <w:rStyle w:val="Hyperlink"/>

</xml_diff>